<commit_message>
fix(p4): correct N=414→623 in cover letter + add ecosystem rankings to Relevance para
- Fix sample size error: N=414 → N=623 (617 for DAI specifications)
- Relevance to MIR: add StartupBlink IBEI 2026 (2nd globally, 99.145/100;
  1st Asia Pacific), Startup Ecosystem Index 2025 (4th), UN e-Gov 2024 (3rd),
  Smart Nation 2.0 (2024) to ground Singapore's advanced-economy status
- Regenerate p4_singapore_cover_letter.docx from updated markdown

https://claude.ai/code/session_01GMFmEtt6FYiJ4MKzBNCLqb
</commit_message>
<xml_diff>
--- a/p4/submission/p4_singapore_cover_letter.docx
+++ b/p4/submission/p4_singapore_cover_letter.docx
@@ -110,7 +110,7 @@
         <w:t xml:space="preserve"> </w:t>
       </w:r>
       <w:r>
-        <w:t xml:space="preserve">(MIR). The manuscript presents an empirical study of the internationalisation–performance (I–P) relationship using World Bank Enterprise Survey microdata for Singapore (2023; N = 414), positioned as an analytically informative boundary-case test at the advanced-economy ceiling of the institutional spectrum.</w:t>
+        <w:t xml:space="preserve">(MIR). The manuscript presents an empirical study of the internationalisation–performance (I–P) relationship using World Bank Enterprise Survey microdata for Singapore (2023; N = 623, N = 617 for specifications including DAI), positioned as an analytically informative boundary-case test at the advanced-economy ceiling of the institutional spectrum.</w:t>
       </w:r>
     </w:p>
     <w:p>
@@ -146,7 +146,7 @@
         <w:t xml:space="preserve"> </w:t>
       </w:r>
       <w:r>
-        <w:t xml:space="preserve">— removes the uniform-premium effect of foundational digital adoption and leaves only the export-contingent signal legible. This configuration provides a theoretical complement to I–P studies in emerging-economy settings and advances MIR’s sustained focus on how institutional and digital environments condition the returns to internationalisation.</w:t>
+        <w:t xml:space="preserve">— removes the uniform-premium effect of foundational digital adoption and leaves only the export-contingent signal legible. Singapore’s advanced-economy positioning is empirically well-established: it ranks 2nd globally in the StartupBlink Innovators Business Environment Index 2026 (score 99.145 out of 100; 1st in Asia Pacific across 30+ governance, capital access, taxation, and digital-infrastructure parameters), 4th in the Global Startup Ecosystem Index 2025, and 3rd in the United Nations e-Government Survey 2024, with the Smart Nation 2.0 initiative (2024) formalising digital trust and growth as national policy pillars. This configuration provides a theoretically precise complement to I–P studies in emerging-economy settings and advances MIR’s sustained focus on how institutional and digital environments condition the returns to internationalisation.</w:t>
       </w:r>
     </w:p>
     <w:p>

</xml_diff>